<commit_message>
docs(contract): add OpenAPI, Scalar, and root documentation
Summary:
- Generate request schemas from the runtime request structs; keep response schemas hand-maintained per domain.
- Add cmd/openapi to write openapi.json deterministically and fail task check when it is stale.
- Serve the document at /api/openapi.json and render it with Scalar at /api/docs.
- Add README, API.md, and ARCHITECTURE.md.
</commit_message>
<xml_diff>
--- a/Livdot Assessment Answer.docx
+++ b/Livdot Assessment Answer.docx
@@ -484,7 +484,10 @@
     </w:p>
     <w:p>
       <w:pPr>
-        <w:rPr/>
+        <w:rPr>
+          <w:b w:val="1"/>
+          <w:bCs w:val="1"/>
+        </w:rPr>
       </w:pPr>
       <w:r>
         <w:rPr>
@@ -493,6 +496,39 @@
           <w:rtl w:val="0"/>
         </w:rPr>
         <w:t xml:space="preserve">E. DATA MODELS</w:t>
+      </w:r>
+    </w:p>
+    <w:p>
+      <w:pPr>
+        <w:rPr/>
+      </w:pPr>
+      <w:r>
+        <w:rPr>
+          <w:rtl w:val="0"/>
+        </w:rPr>
+      </w:r>
+    </w:p>
+    <w:p>
+      <w:pPr>
+        <w:rPr/>
+      </w:pPr>
+      <w:r>
+        <w:rPr>
+          <w:rtl w:val="0"/>
+        </w:rPr>
+        <w:t xml:space="preserve">account</w:t>
+      </w:r>
+    </w:p>
+    <w:p>
+      <w:pPr>
+        <w:rPr/>
+      </w:pPr>
+      <w:r>
+        <w:rPr>
+          <w:rtl w:val="0"/>
+        </w:rPr>
+        <w:t xml:space="preserve">id|email(unique)|password_hash|account_type|created_at|updated_at</w:t>
+        <w:br w:type="textWrapping"/>
       </w:r>
       <w:r>
         <w:rPr>
@@ -510,7 +546,7 @@
         <w:rPr>
           <w:rtl w:val="0"/>
         </w:rPr>
-        <w:t xml:space="preserve">id|email(unique)|password_hash|full_name|updated_at</w:t>
+        <w:t xml:space="preserve">account_id|full_name|updated_at</w:t>
       </w:r>
     </w:p>
     <w:p>
@@ -542,7 +578,7 @@
         <w:rPr>
           <w:rtl w:val="0"/>
         </w:rPr>
-        <w:t xml:space="preserve">id|email(unique)|password_hash|full_name|updated_at</w:t>
+        <w:t xml:space="preserve">account_id|full_name|updated_at</w:t>
       </w:r>
     </w:p>
     <w:p>
@@ -574,7 +610,7 @@
         <w:rPr>
           <w:rtl w:val="0"/>
         </w:rPr>
-        <w:t xml:space="preserve">id|owner_email(unique)|owner_password_hash|crew_name|crew_list|(JSONB)|availability_status|updated_at</w:t>
+        <w:t xml:space="preserve">account_id|crew_name|crew_list|(JSONB)|availability_status|updated_at</w:t>
       </w:r>
     </w:p>
     <w:p>
@@ -606,7 +642,39 @@
         <w:rPr>
           <w:rtl w:val="0"/>
         </w:rPr>
-        <w:t xml:space="preserve">id|email(unique)|password_hash|full_name|role|updated_at</w:t>
+        <w:t xml:space="preserve">account_id|full_name|role|updated_at</w:t>
+      </w:r>
+    </w:p>
+    <w:p>
+      <w:pPr>
+        <w:rPr/>
+      </w:pPr>
+      <w:r>
+        <w:rPr>
+          <w:rtl w:val="0"/>
+        </w:rPr>
+      </w:r>
+    </w:p>
+    <w:p>
+      <w:pPr>
+        <w:rPr/>
+      </w:pPr>
+      <w:r>
+        <w:rPr>
+          <w:rtl w:val="0"/>
+        </w:rPr>
+        <w:t xml:space="preserve">sessions</w:t>
+      </w:r>
+    </w:p>
+    <w:p>
+      <w:pPr>
+        <w:rPr/>
+      </w:pPr>
+      <w:r>
+        <w:rPr>
+          <w:rtl w:val="0"/>
+        </w:rPr>
+        <w:t xml:space="preserve">id|subject_id|token_hash|created_at|expires_at|revoked_at</w:t>
       </w:r>
     </w:p>
     <w:p>
@@ -918,7 +986,7 @@
         <w:br w:type="textWrapping"/>
         <w:t xml:space="preserve">email_notifications</w:t>
         <w:br w:type="textWrapping"/>
-        <w:t xml:space="preserve">id|type|recipient_user_id|recipient_email|template_key|idempotency_key|payload|status(queued, processing, delivered, failed)|attempts|linked_email_notifications_id|retried_at</w:t>
+        <w:t xml:space="preserve">id|type|recipient_user_id|recipient_email|template_key|idempotency_key|payload|status(queued, processing, delivered, failed)|attempt_count|linked_email_notifications_id|retried_at</w:t>
       </w:r>
     </w:p>
     <w:p>

</xml_diff>

<commit_message>
docs: update answer sheet
</commit_message>
<xml_diff>
--- a/Livdot Assessment Answer.docx
+++ b/Livdot Assessment Answer.docx
@@ -91,10 +91,7 @@
     <w:p>
       <w:pPr>
         <w:jc w:val="left"/>
-        <w:rPr>
-          <w:b w:val="1"/>
-          <w:bCs w:val="1"/>
-        </w:rPr>
+        <w:rPr/>
       </w:pPr>
       <w:r>
         <w:rPr>
@@ -103,6 +100,21 @@
           <w:rtl w:val="0"/>
         </w:rPr>
         <w:t xml:space="preserve">Github repository link: </w:t>
+      </w:r>
+      <w:hyperlink r:id="rId7">
+        <w:r>
+          <w:rPr>
+            <w:color w:val="1155cc"/>
+            <w:u w:val="single"/>
+            <w:rtl w:val="0"/>
+          </w:rPr>
+          <w:t xml:space="preserve">https://github.com/Rahmannugar/livdot</w:t>
+        </w:r>
+      </w:hyperlink>
+      <w:r>
+        <w:rPr>
+          <w:rtl w:val="0"/>
+        </w:rPr>
       </w:r>
     </w:p>
     <w:p>

</xml_diff>